<commit_message>
service tasks; updated check referral completeness
</commit_message>
<xml_diff>
--- a/testing/evidence/TC01/TC01REPORT.docx
+++ b/testing/evidence/TC01/TC01REPORT.docx
@@ -66,13 +66,13 @@
         </w:rPr>
         <w:t>The service task should be picked up by the Python worker and</w:t>
       </w:r>
-    </w:p>
-    <w:p>
-      <w:pPr>
-        <w:rPr>
-          <w:rFonts w:hint="default"/>
-        </w:rPr>
-      </w:pPr>
+      <w:r>
+        <w:rPr>
+          <w:rFonts w:hint="default"/>
+          <w:lang w:val="en-US"/>
+        </w:rPr>
+        <w:t xml:space="preserve"> </w:t>
+      </w:r>
       <w:r>
         <w:rPr>
           <w:rFonts w:hint="default"/>
@@ -112,13 +112,13 @@
         </w:rPr>
         <w:t>The Camunda job was successfully created, the Python worker</w:t>
       </w:r>
-    </w:p>
-    <w:p>
-      <w:pPr>
-        <w:rPr>
-          <w:rFonts w:hint="default"/>
-        </w:rPr>
-      </w:pPr>
+      <w:r>
+        <w:rPr>
+          <w:rFonts w:hint="default"/>
+          <w:lang w:val="en-US"/>
+        </w:rPr>
+        <w:t xml:space="preserve"> </w:t>
+      </w:r>
       <w:r>
         <w:rPr>
           <w:rFonts w:hint="default"/>
@@ -246,27 +246,27 @@
       </w:r>
     </w:p>
     <w:p>
-      <w:pPr>
-        <w:rPr>
-          <w:rFonts w:hint="default"/>
-        </w:rPr>
-      </w:pPr>
       <w:r>
         <w:rPr>
           <w:rFonts w:hint="default"/>
         </w:rPr>
         <w:t>This initial test uses a temporary fixed true result and does not</w:t>
       </w:r>
-    </w:p>
-    <w:p>
-      <w:r>
-        <w:rPr>
-          <w:rFonts w:hint="default"/>
-        </w:rPr>
-        <w:t>yet validate real referral form data.</w:t>
+      <w:r>
+        <w:rPr>
+          <w:rFonts w:hint="default"/>
+          <w:lang w:val="en-US"/>
+        </w:rPr>
+        <w:t xml:space="preserve"> </w:t>
       </w:r>
       <w:bookmarkStart w:id="0" w:name="_GoBack"/>
       <w:bookmarkEnd w:id="0"/>
+      <w:r>
+        <w:rPr>
+          <w:rFonts w:hint="default"/>
+        </w:rPr>
+        <w:t>yet validate real referral form data.</w:t>
+      </w:r>
     </w:p>
     <w:sectPr>
       <w:pgSz w:w="11906" w:h="16838"/>

</xml_diff>